<commit_message>
docs: finalize comprehensive LOCAL_ROUTE_기획서_v5 and 6-member team instruction manual with full feature audit
</commit_message>
<xml_diff>
--- a/LOCAL_ROUTE_6인_개발계획서_및_업무지침서.docx
+++ b/LOCAL_ROUTE_6인_개발계획서_및_업무지침서.docx
@@ -45,7 +45,22 @@
         <w:rPr>
           <w:b/>
         </w:rPr>
-        <w:t>작성일</w:t>
+        <w:t>문서 버전</w:t>
+      </w:r>
+      <w:r>
+        <w:t>: v5.0 (상용 프로덕션 팀 운영 규정)</w:t>
+      </w:r>
+    </w:p>
+    <w:p>
+      <w:pPr>
+        <w:pStyle w:val="ListBullet"/>
+      </w:pPr>
+      <w:r/>
+      <w:r>
+        <w:rPr>
+          <w:b/>
+        </w:rPr>
+        <w:t>최종 개정일</w:t>
       </w:r>
       <w:r>
         <w:t>: 2026-08-26</w:t>
@@ -681,7 +696,7 @@
         <w:pStyle w:val="ListBullet"/>
       </w:pPr>
       <w:r>
-        <w:t>[ ] 장소별 필수 필드 전수 검수: 한/영 명칭, 영문 주소, 운영시간, 브레이크타임, 카카오 평점, 알레르기 성분.</w:t>
+        <w:t>[ ] 장소별 필수 필드 전수 검수: 한/영 명칭, 영문 주소, 운영시간, 브레이크타임, 카카오 평점, 알레르기 성분, 야경 전용 사진(`nightImageUrl`).</w:t>
       </w:r>
     </w:p>
     <w:p>
@@ -993,7 +1008,7 @@
         <w:t>비즈니스 API 완비</w:t>
       </w:r>
       <w:r>
-        <w:t>: 일정 CRUD, SSE 실시간 생성 스트리밍, 스토리/피드, S3 Presigned URL.</w:t>
+        <w:t>: 일정 CRUD, SSE 실시간 생성 스트리밍, 트래블 북/스토리 피드, S3 Presigned URL.</w:t>
       </w:r>
     </w:p>
     <w:p>
@@ -1293,7 +1308,7 @@
         <w:pStyle w:val="ListBullet"/>
       </w:pPr>
       <w:r>
-        <w:t>[ ] 모바일 앱 디자인 일관성 교차 QA 지원.</w:t>
+        <w:t>[ ] 모바일 앱 UI/UX 디자인 일관성 교차 QA 지원.</w:t>
       </w:r>
     </w:p>
     <w:p>
@@ -1357,7 +1372,7 @@
         <w:t>Expo 앱 아키텍처</w:t>
       </w:r>
       <w:r>
-        <w:t>: Expo Router 기반 하단 탭 네비게이션, 온보딩, 여행 생성 위저드.</w:t>
+        <w:t>: Expo Router 기반 하단 탭 네비게이션, 온보딩, 1화면 1질문 취향 카드 위저드.</w:t>
       </w:r>
     </w:p>
     <w:p>

</xml_diff>